<commit_message>
Update M4 H1 Integrate AI Builder.docx
</commit_message>
<xml_diff>
--- a/Labs/Week 1/M4 H1 Integrate AI Builder.docx
+++ b/Labs/Week 1/M4 H1 Integrate AI Builder.docx
@@ -188,7 +188,7 @@
                     </pic:cNvPicPr>
                   </pic:nvPicPr>
                   <pic:blipFill>
-                    <a:blip r:embed="rId5">
+                    <a:blip r:embed="rId7">
                       <a:extLst>
                         <a:ext uri="{28A0092B-C50C-407E-A947-70E740481C1C}">
                           <a14:useLocalDpi xmlns:a14="http://schemas.microsoft.com/office/drawing/2010/main" val="0"/>
@@ -255,7 +255,7 @@
                     </pic:cNvPicPr>
                   </pic:nvPicPr>
                   <pic:blipFill>
-                    <a:blip r:embed="rId6">
+                    <a:blip r:embed="rId8">
                       <a:extLst>
                         <a:ext uri="{28A0092B-C50C-407E-A947-70E740481C1C}">
                           <a14:useLocalDpi xmlns:a14="http://schemas.microsoft.com/office/drawing/2010/main" val="0"/>
@@ -363,7 +363,7 @@
                     </pic:cNvPicPr>
                   </pic:nvPicPr>
                   <pic:blipFill>
-                    <a:blip r:embed="rId7">
+                    <a:blip r:embed="rId9">
                       <a:extLst>
                         <a:ext uri="{28A0092B-C50C-407E-A947-70E740481C1C}">
                           <a14:useLocalDpi xmlns:a14="http://schemas.microsoft.com/office/drawing/2010/main" val="0"/>
@@ -440,7 +440,7 @@
                     </pic:cNvPicPr>
                   </pic:nvPicPr>
                   <pic:blipFill>
-                    <a:blip r:embed="rId8">
+                    <a:blip r:embed="rId10">
                       <a:extLst>
                         <a:ext uri="{28A0092B-C50C-407E-A947-70E740481C1C}">
                           <a14:useLocalDpi xmlns:a14="http://schemas.microsoft.com/office/drawing/2010/main" val="0"/>
@@ -516,7 +516,7 @@
                     </pic:cNvPicPr>
                   </pic:nvPicPr>
                   <pic:blipFill>
-                    <a:blip r:embed="rId9">
+                    <a:blip r:embed="rId11">
                       <a:extLst>
                         <a:ext uri="{28A0092B-C50C-407E-A947-70E740481C1C}">
                           <a14:useLocalDpi xmlns:a14="http://schemas.microsoft.com/office/drawing/2010/main" val="0"/>
@@ -607,7 +607,7 @@
         </w:rPr>
         <w:lastRenderedPageBreak/>
         <w:drawing>
-          <wp:inline distT="0" distB="0" distL="0" distR="0" wp14:anchorId="303D2D99" wp14:editId="1BAC74AE">
+          <wp:inline distT="0" distB="0" distL="0" distR="0" wp14:anchorId="303D2D99" wp14:editId="283A6CDA">
             <wp:extent cx="5731510" cy="3153410"/>
             <wp:effectExtent l="0" t="0" r="2540" b="8890"/>
             <wp:docPr id="62489935" name="Picture 123" descr="select as described"/>
@@ -624,7 +624,7 @@
                     </pic:cNvPicPr>
                   </pic:nvPicPr>
                   <pic:blipFill>
-                    <a:blip r:embed="rId10" cstate="print">
+                    <a:blip r:embed="rId12" cstate="print">
                       <a:extLst>
                         <a:ext uri="{28A0092B-C50C-407E-A947-70E740481C1C}">
                           <a14:useLocalDpi xmlns:a14="http://schemas.microsoft.com/office/drawing/2010/main" val="0"/>
@@ -711,7 +711,7 @@
                     </pic:cNvPicPr>
                   </pic:nvPicPr>
                   <pic:blipFill>
-                    <a:blip r:embed="rId11">
+                    <a:blip r:embed="rId13">
                       <a:extLst>
                         <a:ext uri="{28A0092B-C50C-407E-A947-70E740481C1C}">
                           <a14:useLocalDpi xmlns:a14="http://schemas.microsoft.com/office/drawing/2010/main" val="0"/>
@@ -798,7 +798,7 @@
                     </pic:cNvPicPr>
                   </pic:nvPicPr>
                   <pic:blipFill>
-                    <a:blip r:embed="rId12">
+                    <a:blip r:embed="rId14">
                       <a:extLst>
                         <a:ext uri="{28A0092B-C50C-407E-A947-70E740481C1C}">
                           <a14:useLocalDpi xmlns:a14="http://schemas.microsoft.com/office/drawing/2010/main" val="0"/>
@@ -874,7 +874,7 @@
                     </pic:cNvPicPr>
                   </pic:nvPicPr>
                   <pic:blipFill>
-                    <a:blip r:embed="rId13">
+                    <a:blip r:embed="rId15">
                       <a:extLst>
                         <a:ext uri="{28A0092B-C50C-407E-A947-70E740481C1C}">
                           <a14:useLocalDpi xmlns:a14="http://schemas.microsoft.com/office/drawing/2010/main" val="0"/>
@@ -1149,7 +1149,7 @@
                     </pic:cNvPicPr>
                   </pic:nvPicPr>
                   <pic:blipFill>
-                    <a:blip r:embed="rId14">
+                    <a:blip r:embed="rId16">
                       <a:extLst>
                         <a:ext uri="{28A0092B-C50C-407E-A947-70E740481C1C}">
                           <a14:useLocalDpi xmlns:a14="http://schemas.microsoft.com/office/drawing/2010/main" val="0"/>
@@ -1235,7 +1235,7 @@
                     </pic:cNvPicPr>
                   </pic:nvPicPr>
                   <pic:blipFill>
-                    <a:blip r:embed="rId15">
+                    <a:blip r:embed="rId17">
                       <a:extLst>
                         <a:ext uri="{28A0092B-C50C-407E-A947-70E740481C1C}">
                           <a14:useLocalDpi xmlns:a14="http://schemas.microsoft.com/office/drawing/2010/main" val="0"/>
@@ -1333,7 +1333,7 @@
                     </pic:cNvPicPr>
                   </pic:nvPicPr>
                   <pic:blipFill>
-                    <a:blip r:embed="rId16">
+                    <a:blip r:embed="rId18">
                       <a:extLst>
                         <a:ext uri="{28A0092B-C50C-407E-A947-70E740481C1C}">
                           <a14:useLocalDpi xmlns:a14="http://schemas.microsoft.com/office/drawing/2010/main" val="0"/>
@@ -1375,7 +1375,6 @@
       <w:r>
         <w:t>Enter Budget Category and click </w:t>
       </w:r>
-      <w:proofErr w:type="spellStart"/>
       <w:r>
         <w:rPr>
           <w:b/>
@@ -1383,7 +1382,6 @@
         </w:rPr>
         <w:t>Comfirm</w:t>
       </w:r>
-      <w:proofErr w:type="spellEnd"/>
       <w:r>
         <w:t>.</w:t>
       </w:r>
@@ -1411,7 +1409,7 @@
                     </pic:cNvPicPr>
                   </pic:nvPicPr>
                   <pic:blipFill>
-                    <a:blip r:embed="rId17">
+                    <a:blip r:embed="rId19">
                       <a:extLst>
                         <a:ext uri="{28A0092B-C50C-407E-A947-70E740481C1C}">
                           <a14:useLocalDpi xmlns:a14="http://schemas.microsoft.com/office/drawing/2010/main" val="0"/>
@@ -1487,7 +1485,7 @@
                     </pic:cNvPicPr>
                   </pic:nvPicPr>
                   <pic:blipFill>
-                    <a:blip r:embed="rId18">
+                    <a:blip r:embed="rId20">
                       <a:extLst>
                         <a:ext uri="{28A0092B-C50C-407E-A947-70E740481C1C}">
                           <a14:useLocalDpi xmlns:a14="http://schemas.microsoft.com/office/drawing/2010/main" val="0"/>
@@ -1585,7 +1583,7 @@
                     </pic:cNvPicPr>
                   </pic:nvPicPr>
                   <pic:blipFill>
-                    <a:blip r:embed="rId19">
+                    <a:blip r:embed="rId21">
                       <a:extLst>
                         <a:ext uri="{28A0092B-C50C-407E-A947-70E740481C1C}">
                           <a14:useLocalDpi xmlns:a14="http://schemas.microsoft.com/office/drawing/2010/main" val="0"/>
@@ -1705,7 +1703,7 @@
                     </pic:cNvPicPr>
                   </pic:nvPicPr>
                   <pic:blipFill>
-                    <a:blip r:embed="rId20">
+                    <a:blip r:embed="rId22">
                       <a:extLst>
                         <a:ext uri="{28A0092B-C50C-407E-A947-70E740481C1C}">
                           <a14:useLocalDpi xmlns:a14="http://schemas.microsoft.com/office/drawing/2010/main" val="0"/>
@@ -1782,7 +1780,7 @@
                     </pic:cNvPicPr>
                   </pic:nvPicPr>
                   <pic:blipFill>
-                    <a:blip r:embed="rId21">
+                    <a:blip r:embed="rId23">
                       <a:extLst>
                         <a:ext uri="{28A0092B-C50C-407E-A947-70E740481C1C}">
                           <a14:useLocalDpi xmlns:a14="http://schemas.microsoft.com/office/drawing/2010/main" val="0"/>
@@ -1920,7 +1918,7 @@
                     </pic:cNvPicPr>
                   </pic:nvPicPr>
                   <pic:blipFill>
-                    <a:blip r:embed="rId22">
+                    <a:blip r:embed="rId24">
                       <a:extLst>
                         <a:ext uri="{28A0092B-C50C-407E-A947-70E740481C1C}">
                           <a14:useLocalDpi xmlns:a14="http://schemas.microsoft.com/office/drawing/2010/main" val="0"/>
@@ -2018,7 +2016,7 @@
                     </pic:cNvPicPr>
                   </pic:nvPicPr>
                   <pic:blipFill>
-                    <a:blip r:embed="rId23">
+                    <a:blip r:embed="rId25">
                       <a:extLst>
                         <a:ext uri="{28A0092B-C50C-407E-A947-70E740481C1C}">
                           <a14:useLocalDpi xmlns:a14="http://schemas.microsoft.com/office/drawing/2010/main" val="0"/>
@@ -2142,7 +2140,7 @@
                     </pic:cNvPicPr>
                   </pic:nvPicPr>
                   <pic:blipFill>
-                    <a:blip r:embed="rId24">
+                    <a:blip r:embed="rId26">
                       <a:extLst>
                         <a:ext uri="{28A0092B-C50C-407E-A947-70E740481C1C}">
                           <a14:useLocalDpi xmlns:a14="http://schemas.microsoft.com/office/drawing/2010/main" val="0"/>
@@ -2218,7 +2216,7 @@
                     </pic:cNvPicPr>
                   </pic:nvPicPr>
                   <pic:blipFill>
-                    <a:blip r:embed="rId25">
+                    <a:blip r:embed="rId27">
                       <a:extLst>
                         <a:ext uri="{28A0092B-C50C-407E-A947-70E740481C1C}">
                           <a14:useLocalDpi xmlns:a14="http://schemas.microsoft.com/office/drawing/2010/main" val="0"/>
@@ -2258,15 +2256,7 @@
         </w:numPr>
       </w:pPr>
       <w:r>
-        <w:t xml:space="preserve">Select on the </w:t>
-      </w:r>
-      <w:proofErr w:type="gramStart"/>
-      <w:r>
-        <w:t>builder</w:t>
-      </w:r>
-      <w:proofErr w:type="gramEnd"/>
-      <w:r>
-        <w:t xml:space="preserve"> name and select </w:t>
+        <w:t>Select on the builder name and select </w:t>
       </w:r>
       <w:r>
         <w:rPr>
@@ -2355,7 +2345,7 @@
                     </pic:cNvPicPr>
                   </pic:nvPicPr>
                   <pic:blipFill>
-                    <a:blip r:embed="rId26">
+                    <a:blip r:embed="rId28">
                       <a:extLst>
                         <a:ext uri="{28A0092B-C50C-407E-A947-70E740481C1C}">
                           <a14:useLocalDpi xmlns:a14="http://schemas.microsoft.com/office/drawing/2010/main" val="0"/>
@@ -2432,7 +2422,7 @@
                     </pic:cNvPicPr>
                   </pic:nvPicPr>
                   <pic:blipFill>
-                    <a:blip r:embed="rId27">
+                    <a:blip r:embed="rId29">
                       <a:extLst>
                         <a:ext uri="{28A0092B-C50C-407E-A947-70E740481C1C}">
                           <a14:useLocalDpi xmlns:a14="http://schemas.microsoft.com/office/drawing/2010/main" val="0"/>
@@ -2508,7 +2498,7 @@
                     </pic:cNvPicPr>
                   </pic:nvPicPr>
                   <pic:blipFill>
-                    <a:blip r:embed="rId28">
+                    <a:blip r:embed="rId30">
                       <a:extLst>
                         <a:ext uri="{28A0092B-C50C-407E-A947-70E740481C1C}">
                           <a14:useLocalDpi xmlns:a14="http://schemas.microsoft.com/office/drawing/2010/main" val="0"/>
@@ -2574,7 +2564,7 @@
                     </pic:cNvPicPr>
                   </pic:nvPicPr>
                   <pic:blipFill>
-                    <a:blip r:embed="rId29">
+                    <a:blip r:embed="rId31">
                       <a:extLst>
                         <a:ext uri="{28A0092B-C50C-407E-A947-70E740481C1C}">
                           <a14:useLocalDpi xmlns:a14="http://schemas.microsoft.com/office/drawing/2010/main" val="0"/>
@@ -2641,7 +2631,7 @@
                     </pic:cNvPicPr>
                   </pic:nvPicPr>
                   <pic:blipFill>
-                    <a:blip r:embed="rId30">
+                    <a:blip r:embed="rId32">
                       <a:extLst>
                         <a:ext uri="{28A0092B-C50C-407E-A947-70E740481C1C}">
                           <a14:useLocalDpi xmlns:a14="http://schemas.microsoft.com/office/drawing/2010/main" val="0"/>
@@ -2707,7 +2697,7 @@
                     </pic:cNvPicPr>
                   </pic:nvPicPr>
                   <pic:blipFill>
-                    <a:blip r:embed="rId31">
+                    <a:blip r:embed="rId33">
                       <a:extLst>
                         <a:ext uri="{28A0092B-C50C-407E-A947-70E740481C1C}">
                           <a14:useLocalDpi xmlns:a14="http://schemas.microsoft.com/office/drawing/2010/main" val="0"/>
@@ -2773,7 +2763,7 @@
                     </pic:cNvPicPr>
                   </pic:nvPicPr>
                   <pic:blipFill>
-                    <a:blip r:embed="rId32">
+                    <a:blip r:embed="rId34">
                       <a:extLst>
                         <a:ext uri="{28A0092B-C50C-407E-A947-70E740481C1C}">
                           <a14:useLocalDpi xmlns:a14="http://schemas.microsoft.com/office/drawing/2010/main" val="0"/>
@@ -2860,7 +2850,7 @@
                     </pic:cNvPicPr>
                   </pic:nvPicPr>
                   <pic:blipFill>
-                    <a:blip r:embed="rId33">
+                    <a:blip r:embed="rId35">
                       <a:extLst>
                         <a:ext uri="{28A0092B-C50C-407E-A947-70E740481C1C}">
                           <a14:useLocalDpi xmlns:a14="http://schemas.microsoft.com/office/drawing/2010/main" val="0"/>
@@ -2927,7 +2917,7 @@
                     </pic:cNvPicPr>
                   </pic:nvPicPr>
                   <pic:blipFill>
-                    <a:blip r:embed="rId34">
+                    <a:blip r:embed="rId36">
                       <a:extLst>
                         <a:ext uri="{28A0092B-C50C-407E-A947-70E740481C1C}">
                           <a14:useLocalDpi xmlns:a14="http://schemas.microsoft.com/office/drawing/2010/main" val="0"/>
@@ -2993,7 +2983,7 @@
                     </pic:cNvPicPr>
                   </pic:nvPicPr>
                   <pic:blipFill>
-                    <a:blip r:embed="rId35">
+                    <a:blip r:embed="rId37">
                       <a:extLst>
                         <a:ext uri="{28A0092B-C50C-407E-A947-70E740481C1C}">
                           <a14:useLocalDpi xmlns:a14="http://schemas.microsoft.com/office/drawing/2010/main" val="0"/>
@@ -3069,7 +3059,7 @@
                     </pic:cNvPicPr>
                   </pic:nvPicPr>
                   <pic:blipFill>
-                    <a:blip r:embed="rId36">
+                    <a:blip r:embed="rId38">
                       <a:extLst>
                         <a:ext uri="{28A0092B-C50C-407E-A947-70E740481C1C}">
                           <a14:useLocalDpi xmlns:a14="http://schemas.microsoft.com/office/drawing/2010/main" val="0"/>
@@ -3168,7 +3158,7 @@
                     </pic:cNvPicPr>
                   </pic:nvPicPr>
                   <pic:blipFill>
-                    <a:blip r:embed="rId37">
+                    <a:blip r:embed="rId39">
                       <a:extLst>
                         <a:ext uri="{28A0092B-C50C-407E-A947-70E740481C1C}">
                           <a14:useLocalDpi xmlns:a14="http://schemas.microsoft.com/office/drawing/2010/main" val="0"/>
@@ -3256,7 +3246,7 @@
                     </pic:cNvPicPr>
                   </pic:nvPicPr>
                   <pic:blipFill>
-                    <a:blip r:embed="rId38">
+                    <a:blip r:embed="rId40">
                       <a:extLst>
                         <a:ext uri="{28A0092B-C50C-407E-A947-70E740481C1C}">
                           <a14:useLocalDpi xmlns:a14="http://schemas.microsoft.com/office/drawing/2010/main" val="0"/>
@@ -3332,7 +3322,7 @@
                     </pic:cNvPicPr>
                   </pic:nvPicPr>
                   <pic:blipFill>
-                    <a:blip r:embed="rId39">
+                    <a:blip r:embed="rId41">
                       <a:extLst>
                         <a:ext uri="{28A0092B-C50C-407E-A947-70E740481C1C}">
                           <a14:useLocalDpi xmlns:a14="http://schemas.microsoft.com/office/drawing/2010/main" val="0"/>
@@ -3439,7 +3429,7 @@
         </w:rPr>
         <w:lastRenderedPageBreak/>
         <w:drawing>
-          <wp:inline distT="0" distB="0" distL="0" distR="0" wp14:anchorId="1F96889A" wp14:editId="4823ACE4">
+          <wp:inline distT="0" distB="0" distL="0" distR="0" wp14:anchorId="1F96889A" wp14:editId="3CA88671">
             <wp:extent cx="5731510" cy="1746250"/>
             <wp:effectExtent l="0" t="0" r="2540" b="6350"/>
             <wp:docPr id="459524311" name="Picture 93" descr="review and test"/>
@@ -3456,7 +3446,7 @@
                     </pic:cNvPicPr>
                   </pic:nvPicPr>
                   <pic:blipFill>
-                    <a:blip r:embed="rId40" cstate="print">
+                    <a:blip r:embed="rId42" cstate="print">
                       <a:extLst>
                         <a:ext uri="{28A0092B-C50C-407E-A947-70E740481C1C}">
                           <a14:useLocalDpi xmlns:a14="http://schemas.microsoft.com/office/drawing/2010/main" val="0"/>
@@ -3575,7 +3565,7 @@
                     </pic:cNvPicPr>
                   </pic:nvPicPr>
                   <pic:blipFill>
-                    <a:blip r:embed="rId41">
+                    <a:blip r:embed="rId43">
                       <a:extLst>
                         <a:ext uri="{28A0092B-C50C-407E-A947-70E740481C1C}">
                           <a14:useLocalDpi xmlns:a14="http://schemas.microsoft.com/office/drawing/2010/main" val="0"/>
@@ -3642,7 +3632,7 @@
                     </pic:cNvPicPr>
                   </pic:nvPicPr>
                   <pic:blipFill>
-                    <a:blip r:embed="rId42">
+                    <a:blip r:embed="rId44">
                       <a:extLst>
                         <a:ext uri="{28A0092B-C50C-407E-A947-70E740481C1C}">
                           <a14:useLocalDpi xmlns:a14="http://schemas.microsoft.com/office/drawing/2010/main" val="0"/>
@@ -3750,7 +3740,7 @@
                     </pic:cNvPicPr>
                   </pic:nvPicPr>
                   <pic:blipFill>
-                    <a:blip r:embed="rId43">
+                    <a:blip r:embed="rId45">
                       <a:extLst>
                         <a:ext uri="{28A0092B-C50C-407E-A947-70E740481C1C}">
                           <a14:useLocalDpi xmlns:a14="http://schemas.microsoft.com/office/drawing/2010/main" val="0"/>
@@ -3853,6 +3843,41 @@
       </w:pPr>
       <w:r>
         <w:lastRenderedPageBreak/>
+        <w:t xml:space="preserve">Import the solution from </w:t>
+      </w:r>
+      <w:r>
+        <w:rPr>
+          <w:b/>
+          <w:bCs/>
+        </w:rPr>
+        <w:t>Labresource</w:t>
+      </w:r>
+      <w:r>
+        <w:rPr>
+          <w:b/>
+          <w:bCs/>
+        </w:rPr>
+        <w:t>.</w:t>
+      </w:r>
+      <w:r>
+        <w:rPr>
+          <w:b/>
+          <w:bCs/>
+        </w:rPr>
+        <w:t>zip</w:t>
+      </w:r>
+      <w:r>
+        <w:t xml:space="preserve"> file extract it </w:t>
+      </w:r>
+    </w:p>
+    <w:p>
+      <w:pPr>
+        <w:numPr>
+          <w:ilvl w:val="0"/>
+          <w:numId w:val="6"/>
+        </w:numPr>
+      </w:pPr>
+      <w:r>
         <w:t>Select </w:t>
       </w:r>
       <w:r>
@@ -3863,7 +3888,82 @@
         <w:t>Solutions</w:t>
       </w:r>
       <w:r>
-        <w:t> and open the </w:t>
+        <w:rPr>
+          <w:b/>
+          <w:bCs/>
+        </w:rPr>
+        <w:t xml:space="preserve"> in Power Apps</w:t>
+      </w:r>
+      <w:r>
+        <w:t> </w:t>
+      </w:r>
+      <w:r>
+        <w:sym w:font="Wingdings" w:char="F0E0"/>
+      </w:r>
+      <w:r>
+        <w:t xml:space="preserve"> import solution </w:t>
+      </w:r>
+      <w:r>
+        <w:t>ConstructionFunding_1_0_0_1</w:t>
+      </w:r>
+      <w:r>
+        <w:t>.zip</w:t>
+      </w:r>
+      <w:r>
+        <w:t xml:space="preserve"> under Lab resource folder</w:t>
+      </w:r>
+    </w:p>
+    <w:p>
+      <w:pPr>
+        <w:ind w:left="720"/>
+      </w:pPr>
+      <w:r>
+        <w:drawing>
+          <wp:inline distT="0" distB="0" distL="0" distR="0" wp14:anchorId="2C02442D" wp14:editId="4B3CF2F8">
+            <wp:extent cx="4200556" cy="895357"/>
+            <wp:effectExtent l="0" t="0" r="0" b="0"/>
+            <wp:docPr id="898805081" name="Picture 1" descr="A screenshot of a computer&#10;&#10;AI-generated content may be incorrect."/>
+            <wp:cNvGraphicFramePr>
+              <a:graphicFrameLocks xmlns:a="http://schemas.openxmlformats.org/drawingml/2006/main" noChangeAspect="1"/>
+            </wp:cNvGraphicFramePr>
+            <a:graphic xmlns:a="http://schemas.openxmlformats.org/drawingml/2006/main">
+              <a:graphicData uri="http://schemas.openxmlformats.org/drawingml/2006/picture">
+                <pic:pic xmlns:pic="http://schemas.openxmlformats.org/drawingml/2006/picture">
+                  <pic:nvPicPr>
+                    <pic:cNvPr id="898805081" name="Picture 1" descr="A screenshot of a computer&#10;&#10;AI-generated content may be incorrect."/>
+                    <pic:cNvPicPr/>
+                  </pic:nvPicPr>
+                  <pic:blipFill>
+                    <a:blip r:embed="rId46"/>
+                    <a:stretch>
+                      <a:fillRect/>
+                    </a:stretch>
+                  </pic:blipFill>
+                  <pic:spPr>
+                    <a:xfrm>
+                      <a:off x="0" y="0"/>
+                      <a:ext cx="4200556" cy="895357"/>
+                    </a:xfrm>
+                    <a:prstGeom prst="rect">
+                      <a:avLst/>
+                    </a:prstGeom>
+                  </pic:spPr>
+                </pic:pic>
+              </a:graphicData>
+            </a:graphic>
+          </wp:inline>
+        </w:drawing>
+      </w:r>
+    </w:p>
+    <w:p>
+      <w:pPr>
+        <w:numPr>
+          <w:ilvl w:val="0"/>
+          <w:numId w:val="6"/>
+        </w:numPr>
+      </w:pPr>
+      <w:r>
+        <w:t>open the </w:t>
       </w:r>
       <w:r>
         <w:rPr>
@@ -3992,7 +4092,7 @@
                     </pic:cNvPicPr>
                   </pic:nvPicPr>
                   <pic:blipFill>
-                    <a:blip r:embed="rId44">
+                    <a:blip r:embed="rId47">
                       <a:extLst>
                         <a:ext uri="{28A0092B-C50C-407E-A947-70E740481C1C}">
                           <a14:useLocalDpi xmlns:a14="http://schemas.microsoft.com/office/drawing/2010/main" val="0"/>
@@ -4088,7 +4188,7 @@
                     </pic:cNvPicPr>
                   </pic:nvPicPr>
                   <pic:blipFill>
-                    <a:blip r:embed="rId45">
+                    <a:blip r:embed="rId48">
                       <a:extLst>
                         <a:ext uri="{28A0092B-C50C-407E-A947-70E740481C1C}">
                           <a14:useLocalDpi xmlns:a14="http://schemas.microsoft.com/office/drawing/2010/main" val="0"/>
@@ -4177,6 +4277,7 @@
         <w:rPr>
           <w:noProof/>
         </w:rPr>
+        <w:lastRenderedPageBreak/>
         <w:drawing>
           <wp:inline distT="0" distB="0" distL="0" distR="0" wp14:anchorId="3D21D4AE" wp14:editId="38D95594">
             <wp:extent cx="5731510" cy="2618740"/>
@@ -4195,7 +4296,7 @@
                     </pic:cNvPicPr>
                   </pic:nvPicPr>
                   <pic:blipFill>
-                    <a:blip r:embed="rId46">
+                    <a:blip r:embed="rId49">
                       <a:extLst>
                         <a:ext uri="{28A0092B-C50C-407E-A947-70E740481C1C}">
                           <a14:useLocalDpi xmlns:a14="http://schemas.microsoft.com/office/drawing/2010/main" val="0"/>
@@ -4235,7 +4336,6 @@
         </w:numPr>
       </w:pPr>
       <w:r>
-        <w:lastRenderedPageBreak/>
         <w:t>Select </w:t>
       </w:r>
       <w:r>
@@ -4324,7 +4424,7 @@
                     </pic:cNvPicPr>
                   </pic:nvPicPr>
                   <pic:blipFill>
-                    <a:blip r:embed="rId47">
+                    <a:blip r:embed="rId50">
                       <a:extLst>
                         <a:ext uri="{28A0092B-C50C-407E-A947-70E740481C1C}">
                           <a14:useLocalDpi xmlns:a14="http://schemas.microsoft.com/office/drawing/2010/main" val="0"/>
@@ -4449,7 +4549,6 @@
       <w:r>
         <w:t> field and select </w:t>
       </w:r>
-      <w:proofErr w:type="gramStart"/>
       <w:r>
         <w:rPr>
           <w:b/>
@@ -4457,7 +4556,6 @@
         </w:rPr>
         <w:t>To</w:t>
       </w:r>
-      <w:proofErr w:type="gramEnd"/>
       <w:r>
         <w:t> in the dynamic content pane.</w:t>
       </w:r>
@@ -4482,7 +4580,6 @@
       <w:r>
         <w:t> field and select </w:t>
       </w:r>
-      <w:proofErr w:type="gramStart"/>
       <w:r>
         <w:rPr>
           <w:b/>
@@ -4490,7 +4587,6 @@
         </w:rPr>
         <w:t>From</w:t>
       </w:r>
-      <w:proofErr w:type="gramEnd"/>
       <w:r>
         <w:t> in the dynamic content pane.</w:t>
       </w:r>
@@ -4593,7 +4689,7 @@
                     </pic:cNvPicPr>
                   </pic:nvPicPr>
                   <pic:blipFill>
-                    <a:blip r:embed="rId48">
+                    <a:blip r:embed="rId51">
                       <a:extLst>
                         <a:ext uri="{28A0092B-C50C-407E-A947-70E740481C1C}">
                           <a14:useLocalDpi xmlns:a14="http://schemas.microsoft.com/office/drawing/2010/main" val="0"/>
@@ -4721,7 +4817,7 @@
                     </pic:cNvPicPr>
                   </pic:nvPicPr>
                   <pic:blipFill>
-                    <a:blip r:embed="rId49">
+                    <a:blip r:embed="rId52">
                       <a:extLst>
                         <a:ext uri="{28A0092B-C50C-407E-A947-70E740481C1C}">
                           <a14:useLocalDpi xmlns:a14="http://schemas.microsoft.com/office/drawing/2010/main" val="0"/>
@@ -4808,7 +4904,7 @@
                     </pic:cNvPicPr>
                   </pic:nvPicPr>
                   <pic:blipFill>
-                    <a:blip r:embed="rId50">
+                    <a:blip r:embed="rId53">
                       <a:extLst>
                         <a:ext uri="{28A0092B-C50C-407E-A947-70E740481C1C}">
                           <a14:useLocalDpi xmlns:a14="http://schemas.microsoft.com/office/drawing/2010/main" val="0"/>
@@ -4924,29 +5020,8 @@
       </w:r>
     </w:p>
     <w:p>
-      <w:proofErr w:type="spellStart"/>
-      <w:r>
-        <w:t>triggerOutputs</w:t>
-      </w:r>
-      <w:proofErr w:type="spellEnd"/>
-      <w:r>
-        <w:t>(</w:t>
-      </w:r>
-      <w:proofErr w:type="gramStart"/>
-      <w:r>
-        <w:t>)?[</w:t>
-      </w:r>
-      <w:proofErr w:type="gramEnd"/>
-      <w:r>
-        <w:t>'body/attachments']?[</w:t>
-      </w:r>
-      <w:proofErr w:type="gramStart"/>
-      <w:r>
-        <w:t>0][</w:t>
-      </w:r>
-      <w:proofErr w:type="gramEnd"/>
-      <w:r>
-        <w:t>'id']</w:t>
+      <w:r>
+        <w:t>triggerOutputs()?['body/attachments']?[0]['id']</w:t>
       </w:r>
     </w:p>
     <w:p>
@@ -4972,7 +5047,7 @@
                     </pic:cNvPicPr>
                   </pic:nvPicPr>
                   <pic:blipFill>
-                    <a:blip r:embed="rId51">
+                    <a:blip r:embed="rId54">
                       <a:extLst>
                         <a:ext uri="{28A0092B-C50C-407E-A947-70E740481C1C}">
                           <a14:useLocalDpi xmlns:a14="http://schemas.microsoft.com/office/drawing/2010/main" val="0"/>
@@ -5024,7 +5099,6 @@
       <w:r>
         <w:t> and select </w:t>
       </w:r>
-      <w:proofErr w:type="gramStart"/>
       <w:r>
         <w:rPr>
           <w:b/>
@@ -5032,7 +5106,6 @@
         </w:rPr>
         <w:t>To</w:t>
       </w:r>
-      <w:proofErr w:type="gramEnd"/>
       <w:r>
         <w:t> from the dynamic content pane.</w:t>
       </w:r>
@@ -5444,7 +5517,7 @@
                     </pic:cNvPicPr>
                   </pic:nvPicPr>
                   <pic:blipFill>
-                    <a:blip r:embed="rId52">
+                    <a:blip r:embed="rId55">
                       <a:extLst>
                         <a:ext uri="{28A0092B-C50C-407E-A947-70E740481C1C}">
                           <a14:useLocalDpi xmlns:a14="http://schemas.microsoft.com/office/drawing/2010/main" val="0"/>
@@ -5571,7 +5644,7 @@
                     </pic:cNvPicPr>
                   </pic:nvPicPr>
                   <pic:blipFill>
-                    <a:blip r:embed="rId53">
+                    <a:blip r:embed="rId56">
                       <a:extLst>
                         <a:ext uri="{28A0092B-C50C-407E-A947-70E740481C1C}">
                           <a14:useLocalDpi xmlns:a14="http://schemas.microsoft.com/office/drawing/2010/main" val="0"/>
@@ -5658,7 +5731,7 @@
                     </pic:cNvPicPr>
                   </pic:nvPicPr>
                   <pic:blipFill>
-                    <a:blip r:embed="rId54">
+                    <a:blip r:embed="rId57">
                       <a:extLst>
                         <a:ext uri="{28A0092B-C50C-407E-A947-70E740481C1C}">
                           <a14:useLocalDpi xmlns:a14="http://schemas.microsoft.com/office/drawing/2010/main" val="0"/>
@@ -5754,7 +5827,7 @@
                     </pic:cNvPicPr>
                   </pic:nvPicPr>
                   <pic:blipFill>
-                    <a:blip r:embed="rId55">
+                    <a:blip r:embed="rId58">
                       <a:extLst>
                         <a:ext uri="{28A0092B-C50C-407E-A947-70E740481C1C}">
                           <a14:useLocalDpi xmlns:a14="http://schemas.microsoft.com/office/drawing/2010/main" val="0"/>
@@ -5842,7 +5915,7 @@
                     </pic:cNvPicPr>
                   </pic:nvPicPr>
                   <pic:blipFill>
-                    <a:blip r:embed="rId56">
+                    <a:blip r:embed="rId59">
                       <a:extLst>
                         <a:ext uri="{28A0092B-C50C-407E-A947-70E740481C1C}">
                           <a14:useLocalDpi xmlns:a14="http://schemas.microsoft.com/office/drawing/2010/main" val="0"/>
@@ -5928,7 +6001,7 @@
                     </pic:cNvPicPr>
                   </pic:nvPicPr>
                   <pic:blipFill>
-                    <a:blip r:embed="rId57">
+                    <a:blip r:embed="rId60">
                       <a:extLst>
                         <a:ext uri="{28A0092B-C50C-407E-A947-70E740481C1C}">
                           <a14:useLocalDpi xmlns:a14="http://schemas.microsoft.com/office/drawing/2010/main" val="0"/>
@@ -6026,15 +6099,7 @@
     </w:p>
     <w:p>
       <w:r>
-        <w:t>string(</w:t>
-      </w:r>
-      <w:proofErr w:type="gramStart"/>
-      <w:r>
-        <w:t>replace(</w:t>
-      </w:r>
-      <w:proofErr w:type="gramEnd"/>
-      <w:r>
-        <w:t>,'\$',''))</w:t>
+        <w:t>string(replace(,'\$',''))</w:t>
       </w:r>
     </w:p>
     <w:p>
@@ -6081,7 +6146,7 @@
                     </pic:cNvPicPr>
                   </pic:nvPicPr>
                   <pic:blipFill>
-                    <a:blip r:embed="rId58">
+                    <a:blip r:embed="rId61">
                       <a:extLst>
                         <a:ext uri="{28A0092B-C50C-407E-A947-70E740481C1C}">
                           <a14:useLocalDpi xmlns:a14="http://schemas.microsoft.com/office/drawing/2010/main" val="0"/>
@@ -6167,7 +6232,7 @@
                     </pic:cNvPicPr>
                   </pic:nvPicPr>
                   <pic:blipFill>
-                    <a:blip r:embed="rId59">
+                    <a:blip r:embed="rId62">
                       <a:extLst>
                         <a:ext uri="{28A0092B-C50C-407E-A947-70E740481C1C}">
                           <a14:useLocalDpi xmlns:a14="http://schemas.microsoft.com/office/drawing/2010/main" val="0"/>
@@ -6230,7 +6295,6 @@
       <w:r>
         <w:t>Click on the </w:t>
       </w:r>
-      <w:proofErr w:type="gramStart"/>
       <w:r>
         <w:rPr>
           <w:b/>
@@ -6238,7 +6302,6 @@
         </w:rPr>
         <w:t>Requested On</w:t>
       </w:r>
-      <w:proofErr w:type="gramEnd"/>
       <w:r>
         <w:t> field, got the dynamic content pane, select the </w:t>
       </w:r>
@@ -6252,30 +6315,12 @@
       <w:r>
         <w:t> tab, type </w:t>
       </w:r>
-      <w:proofErr w:type="spellStart"/>
-      <w:proofErr w:type="gramStart"/>
-      <w:r>
-        <w:rPr>
-          <w:b/>
-          <w:bCs/>
-        </w:rPr>
-        <w:t>utcNow</w:t>
-      </w:r>
-      <w:proofErr w:type="spellEnd"/>
-      <w:r>
-        <w:rPr>
-          <w:b/>
-          <w:bCs/>
-        </w:rPr>
-        <w:t>(</w:t>
-      </w:r>
-      <w:proofErr w:type="gramEnd"/>
-      <w:r>
-        <w:rPr>
-          <w:b/>
-          <w:bCs/>
-        </w:rPr>
-        <w:t>),</w:t>
+      <w:r>
+        <w:rPr>
+          <w:b/>
+          <w:bCs/>
+        </w:rPr>
+        <w:t>utcNow(),</w:t>
       </w:r>
       <w:r>
         <w:t> and click </w:t>
@@ -6315,7 +6360,7 @@
                     </pic:cNvPicPr>
                   </pic:nvPicPr>
                   <pic:blipFill>
-                    <a:blip r:embed="rId60">
+                    <a:blip r:embed="rId63">
                       <a:extLst>
                         <a:ext uri="{28A0092B-C50C-407E-A947-70E740481C1C}">
                           <a14:useLocalDpi xmlns:a14="http://schemas.microsoft.com/office/drawing/2010/main" val="0"/>
@@ -6409,7 +6454,6 @@
       <w:r>
         <w:t>Remove the </w:t>
       </w:r>
-      <w:proofErr w:type="spellStart"/>
       <w:r>
         <w:rPr>
           <w:b/>
@@ -6417,7 +6461,6 @@
         </w:rPr>
         <w:t>drawAmount</w:t>
       </w:r>
-      <w:proofErr w:type="spellEnd"/>
       <w:r>
         <w:t> value and paste the value you copied.</w:t>
       </w:r>
@@ -6445,7 +6488,7 @@
                     </pic:cNvPicPr>
                   </pic:nvPicPr>
                   <pic:blipFill>
-                    <a:blip r:embed="rId61">
+                    <a:blip r:embed="rId64">
                       <a:extLst>
                         <a:ext uri="{28A0092B-C50C-407E-A947-70E740481C1C}">
                           <a14:useLocalDpi xmlns:a14="http://schemas.microsoft.com/office/drawing/2010/main" val="0"/>
@@ -6508,7 +6551,6 @@
       <w:r>
         <w:t>Remove the </w:t>
       </w:r>
-      <w:proofErr w:type="spellStart"/>
       <w:r>
         <w:rPr>
           <w:b/>
@@ -6516,7 +6558,6 @@
         </w:rPr>
         <w:t>RequestedAmount</w:t>
       </w:r>
-      <w:proofErr w:type="spellEnd"/>
       <w:r>
         <w:t> value and paste the value you copied.</w:t>
       </w:r>
@@ -6545,7 +6586,7 @@
                     </pic:cNvPicPr>
                   </pic:nvPicPr>
                   <pic:blipFill>
-                    <a:blip r:embed="rId62">
+                    <a:blip r:embed="rId65">
                       <a:extLst>
                         <a:ext uri="{28A0092B-C50C-407E-A947-70E740481C1C}">
                           <a14:useLocalDpi xmlns:a14="http://schemas.microsoft.com/office/drawing/2010/main" val="0"/>
@@ -6652,7 +6693,7 @@
                     </pic:cNvPicPr>
                   </pic:nvPicPr>
                   <pic:blipFill>
-                    <a:blip r:embed="rId63">
+                    <a:blip r:embed="rId66">
                       <a:extLst>
                         <a:ext uri="{28A0092B-C50C-407E-A947-70E740481C1C}">
                           <a14:useLocalDpi xmlns:a14="http://schemas.microsoft.com/office/drawing/2010/main" val="0"/>
@@ -6776,7 +6817,7 @@
                     </pic:cNvPicPr>
                   </pic:nvPicPr>
                   <pic:blipFill>
-                    <a:blip r:embed="rId64">
+                    <a:blip r:embed="rId67">
                       <a:extLst>
                         <a:ext uri="{28A0092B-C50C-407E-A947-70E740481C1C}">
                           <a14:useLocalDpi xmlns:a14="http://schemas.microsoft.com/office/drawing/2010/main" val="0"/>
@@ -6870,7 +6911,7 @@
       <w:r>
         <w:t>Send an email to </w:t>
       </w:r>
-      <w:hyperlink r:id="rId65" w:history="1">
+      <w:hyperlink r:id="rId68" w:history="1">
         <w:r>
           <w:rPr>
             <w:rStyle w:val="Hyperlink"/>
@@ -6881,7 +6922,6 @@
       <w:r>
         <w:t> make sure the subject of the email is </w:t>
       </w:r>
-      <w:proofErr w:type="gramStart"/>
       <w:r>
         <w:rPr>
           <w:b/>
@@ -6889,7 +6929,6 @@
         </w:rPr>
         <w:t>MC3747</w:t>
       </w:r>
-      <w:proofErr w:type="gramEnd"/>
       <w:r>
         <w:t> and you attach the </w:t>
       </w:r>
@@ -6991,7 +7030,7 @@
                     </pic:cNvPicPr>
                   </pic:nvPicPr>
                   <pic:blipFill>
-                    <a:blip r:embed="rId66">
+                    <a:blip r:embed="rId69">
                       <a:extLst>
                         <a:ext uri="{28A0092B-C50C-407E-A947-70E740481C1C}">
                           <a14:useLocalDpi xmlns:a14="http://schemas.microsoft.com/office/drawing/2010/main" val="0"/>
@@ -7078,7 +7117,7 @@
                     </pic:cNvPicPr>
                   </pic:nvPicPr>
                   <pic:blipFill>
-                    <a:blip r:embed="rId67">
+                    <a:blip r:embed="rId70">
                       <a:extLst>
                         <a:ext uri="{28A0092B-C50C-407E-A947-70E740481C1C}">
                           <a14:useLocalDpi xmlns:a14="http://schemas.microsoft.com/office/drawing/2010/main" val="0"/>
@@ -7150,6 +7189,56 @@
     </w:sectPr>
   </w:body>
 </w:document>
+</file>
+
+<file path=word/endnotes.xml><?xml version="1.0" encoding="utf-8"?>
+<w:endnotes xmlns:wpc="http://schemas.microsoft.com/office/word/2010/wordprocessingCanvas" xmlns:cx="http://schemas.microsoft.com/office/drawing/2014/chartex" xmlns:cx1="http://schemas.microsoft.com/office/drawing/2015/9/8/chartex" xmlns:cx2="http://schemas.microsoft.com/office/drawing/2015/10/21/chartex" xmlns:cx3="http://schemas.microsoft.com/office/drawing/2016/5/9/chartex" xmlns:cx4="http://schemas.microsoft.com/office/drawing/2016/5/10/chartex" xmlns:cx5="http://schemas.microsoft.com/office/drawing/2016/5/11/chartex" xmlns:cx6="http://schemas.microsoft.com/office/drawing/2016/5/12/chartex" xmlns:cx7="http://schemas.microsoft.com/office/drawing/2016/5/13/chartex" xmlns:cx8="http://schemas.microsoft.com/office/drawing/2016/5/14/chartex" xmlns:mc="http://schemas.openxmlformats.org/markup-compatibility/2006" xmlns:aink="http://schemas.microsoft.com/office/drawing/2016/ink" xmlns:am3d="http://schemas.microsoft.com/office/drawing/2017/model3d" xmlns:o="urn:schemas-microsoft-com:office:office" xmlns:oel="http://schemas.microsoft.com/office/2019/extlst" xmlns:r="http://schemas.openxmlformats.org/officeDocument/2006/relationships" xmlns:m="http://schemas.openxmlformats.org/officeDocument/2006/math" xmlns:v="urn:schemas-microsoft-com:vml" xmlns:wp14="http://schemas.microsoft.com/office/word/2010/wordprocessingDrawing" xmlns:wp="http://schemas.openxmlformats.org/drawingml/2006/wordprocessingDrawing" xmlns:w10="urn:schemas-microsoft-com:office:word" xmlns:w="http://schemas.openxmlformats.org/wordprocessingml/2006/main" xmlns:w14="http://schemas.microsoft.com/office/word/2010/wordml" xmlns:w15="http://schemas.microsoft.com/office/word/2012/wordml" xmlns:w16cex="http://schemas.microsoft.com/office/word/2018/wordml/cex" xmlns:w16cid="http://schemas.microsoft.com/office/word/2016/wordml/cid" xmlns:w16="http://schemas.microsoft.com/office/word/2018/wordml" xmlns:w16du="http://schemas.microsoft.com/office/word/2023/wordml/word16du" xmlns:w16sdtdh="http://schemas.microsoft.com/office/word/2020/wordml/sdtdatahash" xmlns:w16sdtfl="http://schemas.microsoft.com/office/word/2024/wordml/sdtformatlock" xmlns:w16se="http://schemas.microsoft.com/office/word/2015/wordml/symex" xmlns:wpg="http://schemas.microsoft.com/office/word/2010/wordprocessingGroup" xmlns:wpi="http://schemas.microsoft.com/office/word/2010/wordprocessingInk" xmlns:wne="http://schemas.microsoft.com/office/word/2006/wordml" xmlns:wps="http://schemas.microsoft.com/office/word/2010/wordprocessingShape" mc:Ignorable="w14 w15 w16se w16cid w16 w16cex w16sdtdh w16sdtfl w16du wp14">
+  <w:endnote w:type="separator" w:id="-1">
+    <w:p>
+      <w:pPr>
+        <w:spacing w:after="0" w:line="240" w:lineRule="auto"/>
+      </w:pPr>
+      <w:r>
+        <w:separator/>
+      </w:r>
+    </w:p>
+  </w:endnote>
+  <w:endnote w:type="continuationSeparator" w:id="0">
+    <w:p>
+      <w:pPr>
+        <w:spacing w:after="0" w:line="240" w:lineRule="auto"/>
+      </w:pPr>
+      <w:r>
+        <w:continuationSeparator/>
+      </w:r>
+    </w:p>
+  </w:endnote>
+</w:endnotes>
+</file>
+
+<file path=word/footnotes.xml><?xml version="1.0" encoding="utf-8"?>
+<w:footnotes xmlns:wpc="http://schemas.microsoft.com/office/word/2010/wordprocessingCanvas" xmlns:cx="http://schemas.microsoft.com/office/drawing/2014/chartex" xmlns:cx1="http://schemas.microsoft.com/office/drawing/2015/9/8/chartex" xmlns:cx2="http://schemas.microsoft.com/office/drawing/2015/10/21/chartex" xmlns:cx3="http://schemas.microsoft.com/office/drawing/2016/5/9/chartex" xmlns:cx4="http://schemas.microsoft.com/office/drawing/2016/5/10/chartex" xmlns:cx5="http://schemas.microsoft.com/office/drawing/2016/5/11/chartex" xmlns:cx6="http://schemas.microsoft.com/office/drawing/2016/5/12/chartex" xmlns:cx7="http://schemas.microsoft.com/office/drawing/2016/5/13/chartex" xmlns:cx8="http://schemas.microsoft.com/office/drawing/2016/5/14/chartex" xmlns:mc="http://schemas.openxmlformats.org/markup-compatibility/2006" xmlns:aink="http://schemas.microsoft.com/office/drawing/2016/ink" xmlns:am3d="http://schemas.microsoft.com/office/drawing/2017/model3d" xmlns:o="urn:schemas-microsoft-com:office:office" xmlns:oel="http://schemas.microsoft.com/office/2019/extlst" xmlns:r="http://schemas.openxmlformats.org/officeDocument/2006/relationships" xmlns:m="http://schemas.openxmlformats.org/officeDocument/2006/math" xmlns:v="urn:schemas-microsoft-com:vml" xmlns:wp14="http://schemas.microsoft.com/office/word/2010/wordprocessingDrawing" xmlns:wp="http://schemas.openxmlformats.org/drawingml/2006/wordprocessingDrawing" xmlns:w10="urn:schemas-microsoft-com:office:word" xmlns:w="http://schemas.openxmlformats.org/wordprocessingml/2006/main" xmlns:w14="http://schemas.microsoft.com/office/word/2010/wordml" xmlns:w15="http://schemas.microsoft.com/office/word/2012/wordml" xmlns:w16cex="http://schemas.microsoft.com/office/word/2018/wordml/cex" xmlns:w16cid="http://schemas.microsoft.com/office/word/2016/wordml/cid" xmlns:w16="http://schemas.microsoft.com/office/word/2018/wordml" xmlns:w16du="http://schemas.microsoft.com/office/word/2023/wordml/word16du" xmlns:w16sdtdh="http://schemas.microsoft.com/office/word/2020/wordml/sdtdatahash" xmlns:w16sdtfl="http://schemas.microsoft.com/office/word/2024/wordml/sdtformatlock" xmlns:w16se="http://schemas.microsoft.com/office/word/2015/wordml/symex" xmlns:wpg="http://schemas.microsoft.com/office/word/2010/wordprocessingGroup" xmlns:wpi="http://schemas.microsoft.com/office/word/2010/wordprocessingInk" xmlns:wne="http://schemas.microsoft.com/office/word/2006/wordml" xmlns:wps="http://schemas.microsoft.com/office/word/2010/wordprocessingShape" mc:Ignorable="w14 w15 w16se w16cid w16 w16cex w16sdtdh w16sdtfl w16du wp14">
+  <w:footnote w:type="separator" w:id="-1">
+    <w:p>
+      <w:pPr>
+        <w:spacing w:after="0" w:line="240" w:lineRule="auto"/>
+      </w:pPr>
+      <w:r>
+        <w:separator/>
+      </w:r>
+    </w:p>
+  </w:footnote>
+  <w:footnote w:type="continuationSeparator" w:id="0">
+    <w:p>
+      <w:pPr>
+        <w:spacing w:after="0" w:line="240" w:lineRule="auto"/>
+      </w:pPr>
+      <w:r>
+        <w:continuationSeparator/>
+      </w:r>
+    </w:p>
+  </w:footnote>
+</w:footnotes>
 </file>
 
 <file path=word/numbering.xml><?xml version="1.0" encoding="utf-8"?>
@@ -8945,6 +9034,50 @@
       <w:shd w:val="clear" w:color="auto" w:fill="E1DFDD"/>
     </w:rPr>
   </w:style>
+  <w:style w:type="paragraph" w:styleId="Header">
+    <w:name w:val="header"/>
+    <w:basedOn w:val="Normal"/>
+    <w:link w:val="HeaderChar"/>
+    <w:uiPriority w:val="99"/>
+    <w:unhideWhenUsed/>
+    <w:rsid w:val="00D67474"/>
+    <w:pPr>
+      <w:tabs>
+        <w:tab w:val="center" w:pos="4513"/>
+        <w:tab w:val="right" w:pos="9026"/>
+      </w:tabs>
+      <w:spacing w:after="0" w:line="240" w:lineRule="auto"/>
+    </w:pPr>
+  </w:style>
+  <w:style w:type="character" w:customStyle="1" w:styleId="HeaderChar">
+    <w:name w:val="Header Char"/>
+    <w:basedOn w:val="DefaultParagraphFont"/>
+    <w:link w:val="Header"/>
+    <w:uiPriority w:val="99"/>
+    <w:rsid w:val="00D67474"/>
+  </w:style>
+  <w:style w:type="paragraph" w:styleId="Footer">
+    <w:name w:val="footer"/>
+    <w:basedOn w:val="Normal"/>
+    <w:link w:val="FooterChar"/>
+    <w:uiPriority w:val="99"/>
+    <w:unhideWhenUsed/>
+    <w:rsid w:val="00D67474"/>
+    <w:pPr>
+      <w:tabs>
+        <w:tab w:val="center" w:pos="4513"/>
+        <w:tab w:val="right" w:pos="9026"/>
+      </w:tabs>
+      <w:spacing w:after="0" w:line="240" w:lineRule="auto"/>
+    </w:pPr>
+  </w:style>
+  <w:style w:type="character" w:customStyle="1" w:styleId="FooterChar">
+    <w:name w:val="Footer Char"/>
+    <w:basedOn w:val="DefaultParagraphFont"/>
+    <w:link w:val="Footer"/>
+    <w:uiPriority w:val="99"/>
+    <w:rsid w:val="00D67474"/>
+  </w:style>
 </w:styles>
 </file>
 

</xml_diff>